<commit_message>
Add notes on 1967 survey
</commit_message>
<xml_diff>
--- a/Brian-notes-from-sources.docx
+++ b/Brian-notes-from-sources.docx
@@ -6089,23 +6089,7 @@
           <w:sz w:val="16"/>
           <w:szCs w:val="16"/>
         </w:rPr>
-        <w:t>@ARTICLE{NatEd-196</w:t>
-      </w:r>
-      <w:r>
-        <w:rPr>
-          <w:rFonts w:ascii="Consolas" w:hAnsi="Consolas"/>
-          <w:sz w:val="16"/>
-          <w:szCs w:val="16"/>
-        </w:rPr>
-        <w:t>3</w:t>
-      </w:r>
-      <w:r>
-        <w:rPr>
-          <w:rFonts w:ascii="Consolas" w:hAnsi="Consolas"/>
-          <w:sz w:val="16"/>
-          <w:szCs w:val="16"/>
-        </w:rPr>
-        <w:t>,</w:t>
+        <w:t>@ARTICLE{NatEd-1963,</w:t>
       </w:r>
     </w:p>
     <w:p>
@@ -6363,13 +6347,7 @@
         <w:rPr>
           <w:rFonts w:ascii="Times New Roman" w:hAnsi="Times New Roman"/>
         </w:rPr>
-        <w:t xml:space="preserve">". </w:t>
-      </w:r>
-      <w:r>
-        <w:rPr>
-          <w:rFonts w:ascii="Times New Roman" w:hAnsi="Times New Roman"/>
-        </w:rPr>
-        <w:t>[which was entirely bogus; it was 100% used by Education]</w:t>
+        <w:t>". [which was entirely bogus; it was 100% used by Education]</w:t>
       </w:r>
     </w:p>
     <w:p>
@@ -13443,7 +13421,48 @@
       <w:bookmarkEnd w:id="23"/>
       <w:r>
         <w:rPr/>
-        <w:t>Still to be studied</w:t>
+        <w:t>S</w:t>
+      </w:r>
+      <w:r>
+        <w:rPr/>
+        <w:t>cott Survey 1967</w:t>
+      </w:r>
+    </w:p>
+    <w:p>
+      <w:pPr>
+        <w:pStyle w:val="BodyText"/>
+        <w:ind w:hanging="0" w:start="0"/>
+        <w:rPr/>
+      </w:pPr>
+      <w:r>
+        <w:rPr/>
+      </w:r>
+    </w:p>
+    <w:p>
+      <w:pPr>
+        <w:pStyle w:val="BodyText"/>
+        <w:ind w:hanging="0" w:start="0"/>
+        <w:rPr>
+          <w:rFonts w:ascii="Consolas" w:hAnsi="Consolas"/>
+          <w:sz w:val="16"/>
+          <w:szCs w:val="16"/>
+        </w:rPr>
+      </w:pPr>
+      <w:r>
+        <w:rPr>
+          <w:rFonts w:ascii="Consolas" w:hAnsi="Consolas"/>
+          <w:sz w:val="16"/>
+          <w:szCs w:val="16"/>
+        </w:rPr>
+        <w:t>@book{ScottSurvey1967,</w:t>
+        <w:br/>
+        <w:t>title = {{New Zealand Computer Processing - Second annual survey of New Zealand Electronic Data Processing}},</w:t>
+        <w:br/>
+        <w:t>year = "1967",</w:t>
+        <w:br/>
+        <w:t>publisher = {{W. D. Scott \&amp; Company}}</w:t>
+        <w:br/>
+        <w:t>}</w:t>
       </w:r>
     </w:p>
     <w:p>
@@ -13494,33 +13513,552 @@
       <w:pPr>
         <w:pStyle w:val="PreformattedText"/>
         <w:bidi w:val="0"/>
-        <w:jc w:val="start"/>
-        <w:rPr>
-          <w:rFonts w:ascii="Times New Roman" w:hAnsi="Times New Roman"/>
-        </w:rPr>
-      </w:pPr>
-      <w:r>
-        <w:rPr>
-          <w:rFonts w:ascii="Times New Roman" w:hAnsi="Times New Roman"/>
-        </w:rPr>
-        <w:t>1966, MOON B. A. M., Computer Programming for Science and Engineering, First NZ text on programming.</w:t>
-      </w:r>
-    </w:p>
-    <w:p>
-      <w:pPr>
-        <w:pStyle w:val="PreformattedText"/>
-        <w:bidi w:val="0"/>
-        <w:spacing w:before="0" w:after="0"/>
-        <w:jc w:val="start"/>
-        <w:rPr>
-          <w:rFonts w:ascii="Times New Roman" w:hAnsi="Times New Roman"/>
-        </w:rPr>
-      </w:pPr>
-      <w:r>
-        <w:rPr>
-          <w:rFonts w:ascii="Times New Roman" w:hAnsi="Times New Roman"/>
-        </w:rPr>
-        <w:t>1968, W. D. Scott &amp; Co., New Zealand Computer Processing Second annual survey of New Zealand Electronic Data Processing.</w:t>
+        <w:spacing w:before="0" w:after="0"/>
+        <w:jc w:val="start"/>
+        <w:rPr>
+          <w:rFonts w:ascii="Times New Roman" w:hAnsi="Times New Roman"/>
+        </w:rPr>
+      </w:pPr>
+      <w:r>
+        <w:rPr>
+          <w:rFonts w:ascii="Times New Roman" w:hAnsi="Times New Roman"/>
+        </w:rPr>
+        <w:t xml:space="preserve">W. D. Scott &amp; Co., New Zealand Computer Processing - Second annual survey of New Zealand Electronic Data Processing, </w:t>
+      </w:r>
+      <w:r>
+        <w:rPr>
+          <w:rFonts w:ascii="Times New Roman" w:hAnsi="Times New Roman"/>
+        </w:rPr>
+        <w:t>1967 (in Bob Doran’s book collection on floor 5 of 303S).</w:t>
+      </w:r>
+    </w:p>
+    <w:p>
+      <w:pPr>
+        <w:pStyle w:val="PreformattedText"/>
+        <w:bidi w:val="0"/>
+        <w:spacing w:before="0" w:after="0"/>
+        <w:jc w:val="start"/>
+        <w:rPr>
+          <w:rFonts w:ascii="Times New Roman" w:hAnsi="Times New Roman"/>
+        </w:rPr>
+      </w:pPr>
+      <w:r>
+        <w:rPr/>
+      </w:r>
+    </w:p>
+    <w:p>
+      <w:pPr>
+        <w:pStyle w:val="PreformattedText"/>
+        <w:bidi w:val="0"/>
+        <w:spacing w:before="0" w:after="0"/>
+        <w:jc w:val="start"/>
+        <w:rPr>
+          <w:rFonts w:ascii="Times New Roman" w:hAnsi="Times New Roman"/>
+        </w:rPr>
+      </w:pPr>
+      <w:r>
+        <w:rPr>
+          <w:rFonts w:ascii="Times New Roman" w:hAnsi="Times New Roman"/>
+        </w:rPr>
+        <w:t>Scott was a company of management consultants. There is some meat in this survey but also a lot of rather prolix management-speak.</w:t>
+      </w:r>
+    </w:p>
+    <w:p>
+      <w:pPr>
+        <w:pStyle w:val="PreformattedText"/>
+        <w:bidi w:val="0"/>
+        <w:spacing w:before="0" w:after="0"/>
+        <w:jc w:val="start"/>
+        <w:rPr>
+          <w:rFonts w:ascii="Times New Roman" w:hAnsi="Times New Roman"/>
+        </w:rPr>
+      </w:pPr>
+      <w:r>
+        <w:rPr/>
+      </w:r>
+    </w:p>
+    <w:p>
+      <w:pPr>
+        <w:pStyle w:val="PreformattedText"/>
+        <w:bidi w:val="0"/>
+        <w:spacing w:before="0" w:after="0"/>
+        <w:jc w:val="start"/>
+        <w:rPr>
+          <w:rFonts w:ascii="Times New Roman" w:hAnsi="Times New Roman"/>
+        </w:rPr>
+      </w:pPr>
+      <w:r>
+        <w:rPr>
+          <w:rFonts w:ascii="Times New Roman" w:hAnsi="Times New Roman"/>
+        </w:rPr>
+        <w:t>p18: Notes that foreign exchange is a worsening issue, import licences likely “only in the most economically justifiable cases. Devaluation will cause a rise in rentals... Are we in New Zealand to be the first managers forced into securing the profitable operation of computers?”</w:t>
+      </w:r>
+    </w:p>
+    <w:p>
+      <w:pPr>
+        <w:pStyle w:val="PreformattedText"/>
+        <w:bidi w:val="0"/>
+        <w:spacing w:before="0" w:after="0"/>
+        <w:jc w:val="start"/>
+        <w:rPr>
+          <w:rFonts w:ascii="Times New Roman" w:hAnsi="Times New Roman"/>
+        </w:rPr>
+      </w:pPr>
+      <w:r>
+        <w:rPr/>
+      </w:r>
+    </w:p>
+    <w:p>
+      <w:pPr>
+        <w:pStyle w:val="PreformattedText"/>
+        <w:bidi w:val="0"/>
+        <w:spacing w:before="0" w:after="0"/>
+        <w:jc w:val="start"/>
+        <w:rPr>
+          <w:rFonts w:ascii="Times New Roman" w:hAnsi="Times New Roman"/>
+        </w:rPr>
+      </w:pPr>
+      <w:r>
+        <w:rPr>
+          <w:rFonts w:ascii="Times New Roman" w:hAnsi="Times New Roman"/>
+        </w:rPr>
+        <w:t>Also “trends... point to an increasing use of bureau services – principally independent bureaus.”</w:t>
+      </w:r>
+    </w:p>
+    <w:p>
+      <w:pPr>
+        <w:pStyle w:val="PreformattedText"/>
+        <w:bidi w:val="0"/>
+        <w:spacing w:before="0" w:after="0"/>
+        <w:jc w:val="start"/>
+        <w:rPr>
+          <w:rFonts w:ascii="Times New Roman" w:hAnsi="Times New Roman"/>
+        </w:rPr>
+      </w:pPr>
+      <w:r>
+        <w:rPr/>
+      </w:r>
+    </w:p>
+    <w:p>
+      <w:pPr>
+        <w:pStyle w:val="PreformattedText"/>
+        <w:bidi w:val="0"/>
+        <w:spacing w:before="0" w:after="0"/>
+        <w:jc w:val="start"/>
+        <w:rPr>
+          <w:rFonts w:ascii="Times New Roman" w:hAnsi="Times New Roman"/>
+        </w:rPr>
+      </w:pPr>
+      <w:r>
+        <w:rPr>
+          <w:rFonts w:ascii="Times New Roman" w:hAnsi="Times New Roman"/>
+        </w:rPr>
+        <w:t>More education is needed. “It is not sufficient for the Universities to provide computer facilities and training only at the scientific level. The Tecnical and Management Institutes cannot be left to their own devices... the secondary schools (and before too long the primary schools) must introduce computer knowledge...”</w:t>
+      </w:r>
+    </w:p>
+    <w:p>
+      <w:pPr>
+        <w:pStyle w:val="PreformattedText"/>
+        <w:bidi w:val="0"/>
+        <w:spacing w:before="0" w:after="0"/>
+        <w:jc w:val="start"/>
+        <w:rPr>
+          <w:rFonts w:ascii="Times New Roman" w:hAnsi="Times New Roman"/>
+        </w:rPr>
+      </w:pPr>
+      <w:r>
+        <w:rPr/>
+      </w:r>
+    </w:p>
+    <w:p>
+      <w:pPr>
+        <w:pStyle w:val="PreformattedText"/>
+        <w:bidi w:val="0"/>
+        <w:spacing w:before="0" w:after="0"/>
+        <w:jc w:val="start"/>
+        <w:rPr>
+          <w:rFonts w:ascii="Times New Roman" w:hAnsi="Times New Roman"/>
+        </w:rPr>
+      </w:pPr>
+      <w:r>
+        <w:rPr>
+          <w:rFonts w:ascii="Times New Roman" w:hAnsi="Times New Roman"/>
+        </w:rPr>
+        <w:t>p19: among other technical trends, notes “The extension of data communications in a variety of forms internationally” and “The trend towards the high-level languages.”</w:t>
+      </w:r>
+    </w:p>
+    <w:p>
+      <w:pPr>
+        <w:pStyle w:val="PreformattedText"/>
+        <w:bidi w:val="0"/>
+        <w:spacing w:before="0" w:after="0"/>
+        <w:jc w:val="start"/>
+        <w:rPr>
+          <w:rFonts w:ascii="Times New Roman" w:hAnsi="Times New Roman"/>
+        </w:rPr>
+      </w:pPr>
+      <w:r>
+        <w:rPr/>
+      </w:r>
+    </w:p>
+    <w:p>
+      <w:pPr>
+        <w:pStyle w:val="PreformattedText"/>
+        <w:bidi w:val="0"/>
+        <w:spacing w:before="0" w:after="0"/>
+        <w:jc w:val="start"/>
+        <w:rPr>
+          <w:rFonts w:ascii="Times New Roman" w:hAnsi="Times New Roman"/>
+        </w:rPr>
+      </w:pPr>
+      <w:r>
+        <w:rPr>
+          <w:rFonts w:ascii="Times New Roman" w:hAnsi="Times New Roman"/>
+        </w:rPr>
+        <w:t xml:space="preserve">p38: “The EDP Manager’s Profile” “He” on average is 37, recruited internally, probably qualified in accountancy, </w:t>
+      </w:r>
+      <w:r>
+        <w:rPr>
+          <w:rFonts w:ascii="Times New Roman" w:hAnsi="Times New Roman"/>
+        </w:rPr>
+        <w:t>often has limited prior experience in EDP, and paid $4580NZ p.a. [According to the NZ Yearbook for 1970, the average salary for “Company directors and managers ” in 1967-68 was $</w:t>
+      </w:r>
+      <w:r>
+        <w:rPr>
+          <w:rFonts w:ascii="Times New Roman" w:hAnsi="Times New Roman"/>
+        </w:rPr>
+        <w:t>4220, so this was a good salary</w:t>
+      </w:r>
+      <w:r>
+        <w:rPr>
+          <w:rFonts w:ascii="Times New Roman" w:hAnsi="Times New Roman"/>
+        </w:rPr>
+        <w:t>.]</w:t>
+      </w:r>
+    </w:p>
+    <w:p>
+      <w:pPr>
+        <w:pStyle w:val="PreformattedText"/>
+        <w:bidi w:val="0"/>
+        <w:spacing w:before="0" w:after="0"/>
+        <w:jc w:val="start"/>
+        <w:rPr>
+          <w:rFonts w:ascii="Times New Roman" w:hAnsi="Times New Roman"/>
+        </w:rPr>
+      </w:pPr>
+      <w:r>
+        <w:rPr/>
+      </w:r>
+    </w:p>
+    <w:p>
+      <w:pPr>
+        <w:pStyle w:val="PreformattedText"/>
+        <w:bidi w:val="0"/>
+        <w:spacing w:before="0" w:after="0"/>
+        <w:jc w:val="start"/>
+        <w:rPr>
+          <w:rFonts w:ascii="Times New Roman" w:hAnsi="Times New Roman"/>
+        </w:rPr>
+      </w:pPr>
+      <w:r>
+        <w:rPr>
+          <w:rFonts w:ascii="Times New Roman" w:hAnsi="Times New Roman"/>
+        </w:rPr>
+        <w:t>p</w:t>
+      </w:r>
+      <w:r>
+        <w:rPr>
+          <w:rFonts w:ascii="Times New Roman" w:hAnsi="Times New Roman"/>
+        </w:rPr>
+        <w:t>42: User-perceived benefits of EDP: speed, accuracy, improved reporting, improved organisational control, staff savings.</w:t>
+      </w:r>
+    </w:p>
+    <w:p>
+      <w:pPr>
+        <w:pStyle w:val="PreformattedText"/>
+        <w:bidi w:val="0"/>
+        <w:spacing w:before="0" w:after="0"/>
+        <w:jc w:val="start"/>
+        <w:rPr>
+          <w:rFonts w:ascii="Times New Roman" w:hAnsi="Times New Roman"/>
+        </w:rPr>
+      </w:pPr>
+      <w:r>
+        <w:rPr>
+          <w:rFonts w:ascii="Times New Roman" w:hAnsi="Times New Roman"/>
+        </w:rPr>
+        <w:t>Important applications: invoicing, payroll, stock control, expense analysis, sales statistics.</w:t>
+      </w:r>
+    </w:p>
+    <w:p>
+      <w:pPr>
+        <w:pStyle w:val="PreformattedText"/>
+        <w:bidi w:val="0"/>
+        <w:spacing w:before="0" w:after="0"/>
+        <w:jc w:val="start"/>
+        <w:rPr>
+          <w:rFonts w:ascii="Times New Roman" w:hAnsi="Times New Roman"/>
+        </w:rPr>
+      </w:pPr>
+      <w:r>
+        <w:rPr/>
+      </w:r>
+    </w:p>
+    <w:p>
+      <w:pPr>
+        <w:pStyle w:val="PreformattedText"/>
+        <w:bidi w:val="0"/>
+        <w:spacing w:before="0" w:after="0"/>
+        <w:jc w:val="start"/>
+        <w:rPr>
+          <w:rFonts w:ascii="Times New Roman" w:hAnsi="Times New Roman"/>
+        </w:rPr>
+      </w:pPr>
+      <w:r>
+        <w:rPr>
+          <w:rFonts w:ascii="Times New Roman" w:hAnsi="Times New Roman"/>
+        </w:rPr>
+        <w:t>p50: Training is mainly from the computer vendor or on-the-job.</w:t>
+      </w:r>
+    </w:p>
+    <w:p>
+      <w:pPr>
+        <w:pStyle w:val="PreformattedText"/>
+        <w:bidi w:val="0"/>
+        <w:spacing w:before="0" w:after="0"/>
+        <w:jc w:val="start"/>
+        <w:rPr>
+          <w:rFonts w:ascii="Times New Roman" w:hAnsi="Times New Roman"/>
+        </w:rPr>
+      </w:pPr>
+      <w:r>
+        <w:rPr>
+          <w:rFonts w:ascii="Times New Roman" w:hAnsi="Times New Roman"/>
+        </w:rPr>
+        <w:t>p82: Operating hours per month average 250  (1966: 165) (1968 planned: 276)</w:t>
+      </w:r>
+    </w:p>
+    <w:p>
+      <w:pPr>
+        <w:pStyle w:val="PreformattedText"/>
+        <w:bidi w:val="0"/>
+        <w:spacing w:before="0" w:after="0"/>
+        <w:jc w:val="start"/>
+        <w:rPr>
+          <w:rFonts w:ascii="Times New Roman" w:hAnsi="Times New Roman"/>
+        </w:rPr>
+      </w:pPr>
+      <w:r>
+        <w:rPr/>
+      </w:r>
+    </w:p>
+    <w:p>
+      <w:pPr>
+        <w:pStyle w:val="PreformattedText"/>
+        <w:bidi w:val="0"/>
+        <w:spacing w:before="0" w:after="0"/>
+        <w:jc w:val="start"/>
+        <w:rPr>
+          <w:rFonts w:ascii="Times New Roman" w:hAnsi="Times New Roman"/>
+        </w:rPr>
+      </w:pPr>
+      <w:r>
+        <w:rPr>
+          <w:rFonts w:ascii="Times New Roman" w:hAnsi="Times New Roman"/>
+        </w:rPr>
+        <w:t>p85: 46% sites still on a single shift! Only 41% on two shifts regularly, and 8% on three shifts. [The Treasury was cofrrect in feeling that these expensive imports were under-utilised.]</w:t>
+      </w:r>
+    </w:p>
+    <w:p>
+      <w:pPr>
+        <w:pStyle w:val="PreformattedText"/>
+        <w:bidi w:val="0"/>
+        <w:spacing w:before="0" w:after="0"/>
+        <w:jc w:val="start"/>
+        <w:rPr>
+          <w:rFonts w:ascii="Times New Roman" w:hAnsi="Times New Roman"/>
+        </w:rPr>
+      </w:pPr>
+      <w:r>
+        <w:rPr/>
+      </w:r>
+    </w:p>
+    <w:p>
+      <w:pPr>
+        <w:pStyle w:val="PreformattedText"/>
+        <w:bidi w:val="0"/>
+        <w:spacing w:before="0" w:after="0"/>
+        <w:jc w:val="start"/>
+        <w:rPr>
+          <w:rFonts w:ascii="Times New Roman" w:hAnsi="Times New Roman"/>
+        </w:rPr>
+      </w:pPr>
+      <w:r>
+        <w:rPr>
+          <w:rFonts w:ascii="Times New Roman" w:hAnsi="Times New Roman"/>
+        </w:rPr>
+        <w:t>p86/87: lists applications used by users. Top dogs: Sales statistics, debtors, inventory, invoicing, general ledger. But since 1966, math/scientific and project planning have doubled in popularity: it’s no longer just about accounting.</w:t>
+      </w:r>
+    </w:p>
+    <w:p>
+      <w:pPr>
+        <w:pStyle w:val="PreformattedText"/>
+        <w:bidi w:val="0"/>
+        <w:spacing w:before="0" w:after="0"/>
+        <w:jc w:val="start"/>
+        <w:rPr>
+          <w:rFonts w:ascii="Times New Roman" w:hAnsi="Times New Roman"/>
+        </w:rPr>
+      </w:pPr>
+      <w:r>
+        <w:rPr/>
+      </w:r>
+    </w:p>
+    <w:p>
+      <w:pPr>
+        <w:pStyle w:val="PreformattedText"/>
+        <w:bidi w:val="0"/>
+        <w:spacing w:before="0" w:after="0"/>
+        <w:jc w:val="start"/>
+        <w:rPr>
+          <w:rFonts w:ascii="Times New Roman" w:hAnsi="Times New Roman"/>
+        </w:rPr>
+      </w:pPr>
+      <w:r>
+        <w:rPr>
+          <w:rFonts w:ascii="Times New Roman" w:hAnsi="Times New Roman"/>
+        </w:rPr>
+        <w:t>p112: among  owner-users, only 68% charge internal users for usage: “one of chief reasons why installations can be uneconomic”.</w:t>
+      </w:r>
+    </w:p>
+    <w:p>
+      <w:pPr>
+        <w:pStyle w:val="PreformattedText"/>
+        <w:bidi w:val="0"/>
+        <w:spacing w:before="0" w:after="0"/>
+        <w:jc w:val="start"/>
+        <w:rPr>
+          <w:rFonts w:ascii="Times New Roman" w:hAnsi="Times New Roman"/>
+        </w:rPr>
+      </w:pPr>
+      <w:r>
+        <w:rPr/>
+      </w:r>
+    </w:p>
+    <w:p>
+      <w:pPr>
+        <w:pStyle w:val="PreformattedText"/>
+        <w:bidi w:val="0"/>
+        <w:spacing w:before="0" w:after="0"/>
+        <w:jc w:val="start"/>
+        <w:rPr>
+          <w:rFonts w:ascii="Times New Roman" w:hAnsi="Times New Roman"/>
+        </w:rPr>
+      </w:pPr>
+      <w:r>
+        <w:rPr>
+          <w:rFonts w:ascii="Times New Roman" w:hAnsi="Times New Roman"/>
+        </w:rPr>
+        <w:t>p115: shows that the survey went to 100 computer owners (claimed to be an exact coun</w:t>
+      </w:r>
+      <w:r>
+        <w:rPr>
+          <w:rFonts w:ascii="Times New Roman" w:hAnsi="Times New Roman"/>
+        </w:rPr>
+        <w:t xml:space="preserve">t </w:t>
+      </w:r>
+      <w:r>
+        <w:rPr>
+          <w:rFonts w:ascii="Times New Roman" w:hAnsi="Times New Roman"/>
+        </w:rPr>
+        <w:t>based on in</w:t>
+      </w:r>
+      <w:r>
+        <w:rPr>
+          <w:rFonts w:ascii="Times New Roman" w:hAnsi="Times New Roman"/>
+        </w:rPr>
+        <w:t>f</w:t>
+      </w:r>
+      <w:r>
+        <w:rPr>
+          <w:rFonts w:ascii="Times New Roman" w:hAnsi="Times New Roman"/>
+        </w:rPr>
+        <w:t>o f</w:t>
+      </w:r>
+      <w:r>
+        <w:rPr>
+          <w:rFonts w:ascii="Times New Roman" w:hAnsi="Times New Roman"/>
+        </w:rPr>
+        <w:t>r</w:t>
+      </w:r>
+      <w:r>
+        <w:rPr>
+          <w:rFonts w:ascii="Times New Roman" w:hAnsi="Times New Roman"/>
+        </w:rPr>
+        <w:t>om vendors)</w:t>
+      </w:r>
+    </w:p>
+    <w:p>
+      <w:pPr>
+        <w:pStyle w:val="PreformattedText"/>
+        <w:bidi w:val="0"/>
+        <w:spacing w:before="0" w:after="0"/>
+        <w:jc w:val="start"/>
+        <w:rPr>
+          <w:rFonts w:ascii="Times New Roman" w:hAnsi="Times New Roman"/>
+        </w:rPr>
+      </w:pPr>
+      <w:r>
+        <w:rPr>
+          <w:rFonts w:ascii="Times New Roman" w:hAnsi="Times New Roman"/>
+        </w:rPr>
+        <w:t>and to 244 bureau users</w:t>
+      </w:r>
+    </w:p>
+    <w:p>
+      <w:pPr>
+        <w:pStyle w:val="PreformattedText"/>
+        <w:bidi w:val="0"/>
+        <w:spacing w:before="0" w:after="0"/>
+        <w:jc w:val="start"/>
+        <w:rPr>
+          <w:rFonts w:ascii="Times New Roman" w:hAnsi="Times New Roman"/>
+        </w:rPr>
+      </w:pPr>
+      <w:r>
+        <w:rPr/>
+      </w:r>
+    </w:p>
+    <w:p>
+      <w:pPr>
+        <w:pStyle w:val="PreformattedText"/>
+        <w:bidi w:val="0"/>
+        <w:spacing w:before="0" w:after="0"/>
+        <w:jc w:val="start"/>
+        <w:rPr>
+          <w:rFonts w:ascii="Times New Roman" w:hAnsi="Times New Roman"/>
+        </w:rPr>
+      </w:pPr>
+      <w:r>
+        <w:rPr>
+          <w:rFonts w:ascii="Times New Roman" w:hAnsi="Times New Roman"/>
+        </w:rPr>
+        <w:t>No count of the existing bureaus was found, but p121 notes that there is rapid growth in the number of non-vendor bureaus since 1966, with their total user count increasing from 33 to 78 and a corresponding decrease in the user count for vendor-operated bureaus.</w:t>
+      </w:r>
+    </w:p>
+    <w:p>
+      <w:pPr>
+        <w:pStyle w:val="PreformattedText"/>
+        <w:bidi w:val="0"/>
+        <w:spacing w:before="0" w:after="0"/>
+        <w:jc w:val="start"/>
+        <w:rPr>
+          <w:rFonts w:ascii="Times New Roman" w:hAnsi="Times New Roman"/>
+        </w:rPr>
+      </w:pPr>
+      <w:r>
+        <w:rPr/>
+        <w:t xml:space="preserve">                                           </w:t>
       </w:r>
     </w:p>
     <w:sectPr>
@@ -13561,7 +14099,7 @@
     </w:r>
     <w:r>
       <w:rPr/>
-      <w:t>1</w:t>
+      <w:t>20</w:t>
     </w:r>
     <w:r>
       <w:rPr/>
@@ -14087,6 +14625,29 @@
     </w:pPr>
     <w:rPr/>
   </w:style>
+  <w:style w:type="paragraph" w:styleId="TableContents">
+    <w:name w:val="Table Contents"/>
+    <w:basedOn w:val="Normal"/>
+    <w:qFormat/>
+    <w:pPr>
+      <w:widowControl w:val="false"/>
+      <w:suppressLineNumbers/>
+    </w:pPr>
+    <w:rPr/>
+  </w:style>
+  <w:style w:type="paragraph" w:styleId="TableHeading">
+    <w:name w:val="Table Heading"/>
+    <w:basedOn w:val="TableContents"/>
+    <w:qFormat/>
+    <w:pPr>
+      <w:suppressLineNumbers/>
+      <w:jc w:val="center"/>
+    </w:pPr>
+    <w:rPr>
+      <w:b/>
+      <w:bCs/>
+    </w:rPr>
+  </w:style>
 </w:styles>
 </file>
 

</xml_diff>

<commit_message>
Added details from the 1967 Scott survey
</commit_message>
<xml_diff>
--- a/Brian-notes-from-sources.docx
+++ b/Brian-notes-from-sources.docx
@@ -13421,11 +13421,7 @@
       <w:bookmarkEnd w:id="23"/>
       <w:r>
         <w:rPr/>
-        <w:t>S</w:t>
-      </w:r>
-      <w:r>
-        <w:rPr/>
-        <w:t>cott Survey 1967</w:t>
+        <w:t>Scott Survey 1967</w:t>
       </w:r>
     </w:p>
     <w:p>
@@ -13523,27 +13519,23 @@
         <w:rPr>
           <w:rFonts w:ascii="Times New Roman" w:hAnsi="Times New Roman"/>
         </w:rPr>
-        <w:t xml:space="preserve">W. D. Scott &amp; Co., New Zealand Computer Processing - Second annual survey of New Zealand Electronic Data Processing, </w:t>
-      </w:r>
-      <w:r>
-        <w:rPr>
-          <w:rFonts w:ascii="Times New Roman" w:hAnsi="Times New Roman"/>
-        </w:rPr>
-        <w:t>1967 (in Bob Doran’s book collection on floor 5 of 303S).</w:t>
-      </w:r>
-    </w:p>
-    <w:p>
-      <w:pPr>
-        <w:pStyle w:val="PreformattedText"/>
-        <w:bidi w:val="0"/>
-        <w:spacing w:before="0" w:after="0"/>
-        <w:jc w:val="start"/>
-        <w:rPr>
-          <w:rFonts w:ascii="Times New Roman" w:hAnsi="Times New Roman"/>
-        </w:rPr>
-      </w:pPr>
-      <w:r>
-        <w:rPr/>
+        <w:t>W. D. Scott &amp; Co., New Zealand Computer Processing - Second annual survey of New Zealand Electronic Data Processing, 1967 (in Bob Doran’s book collection on floor 5 of 303S).</w:t>
+      </w:r>
+    </w:p>
+    <w:p>
+      <w:pPr>
+        <w:pStyle w:val="PreformattedText"/>
+        <w:bidi w:val="0"/>
+        <w:spacing w:before="0" w:after="0"/>
+        <w:jc w:val="start"/>
+        <w:rPr>
+          <w:rFonts w:ascii="Times New Roman" w:hAnsi="Times New Roman"/>
+        </w:rPr>
+      </w:pPr>
+      <w:r>
+        <w:rPr>
+          <w:rFonts w:ascii="Times New Roman" w:hAnsi="Times New Roman"/>
+        </w:rPr>
       </w:r>
     </w:p>
     <w:p>
@@ -13574,7 +13566,9 @@
         </w:rPr>
       </w:pPr>
       <w:r>
-        <w:rPr/>
+        <w:rPr>
+          <w:rFonts w:ascii="Times New Roman" w:hAnsi="Times New Roman"/>
+        </w:rPr>
       </w:r>
     </w:p>
     <w:p>
@@ -13605,7 +13599,10 @@
         </w:rPr>
       </w:pPr>
       <w:r>
-        <w:rPr/>
+        <w:rPr>
+          <w:rFonts w:ascii="Times New Roman" w:hAnsi="Times New Roman"/>
+        </w:rPr>
+        <w:t xml:space="preserve">                                                                                                                                                                    </w:t>
       </w:r>
     </w:p>
     <w:p>
@@ -13636,7 +13633,9 @@
         </w:rPr>
       </w:pPr>
       <w:r>
-        <w:rPr/>
+        <w:rPr>
+          <w:rFonts w:ascii="Times New Roman" w:hAnsi="Times New Roman"/>
+        </w:rPr>
       </w:r>
     </w:p>
     <w:p>
@@ -13667,7 +13666,9 @@
         </w:rPr>
       </w:pPr>
       <w:r>
-        <w:rPr/>
+        <w:rPr>
+          <w:rFonts w:ascii="Times New Roman" w:hAnsi="Times New Roman"/>
+        </w:rPr>
       </w:r>
     </w:p>
     <w:p>
@@ -13698,79 +13699,59 @@
         </w:rPr>
       </w:pPr>
       <w:r>
-        <w:rPr/>
-      </w:r>
-    </w:p>
-    <w:p>
-      <w:pPr>
-        <w:pStyle w:val="PreformattedText"/>
-        <w:bidi w:val="0"/>
-        <w:spacing w:before="0" w:after="0"/>
-        <w:jc w:val="start"/>
-        <w:rPr>
-          <w:rFonts w:ascii="Times New Roman" w:hAnsi="Times New Roman"/>
-        </w:rPr>
-      </w:pPr>
-      <w:r>
-        <w:rPr>
-          <w:rFonts w:ascii="Times New Roman" w:hAnsi="Times New Roman"/>
-        </w:rPr>
-        <w:t xml:space="preserve">p38: “The EDP Manager’s Profile” “He” on average is 37, recruited internally, probably qualified in accountancy, </w:t>
-      </w:r>
-      <w:r>
-        <w:rPr>
-          <w:rFonts w:ascii="Times New Roman" w:hAnsi="Times New Roman"/>
-        </w:rPr>
-        <w:t>often has limited prior experience in EDP, and paid $4580NZ p.a. [According to the NZ Yearbook for 1970, the average salary for “Company directors and managers ” in 1967-68 was $</w:t>
-      </w:r>
-      <w:r>
-        <w:rPr>
-          <w:rFonts w:ascii="Times New Roman" w:hAnsi="Times New Roman"/>
-        </w:rPr>
-        <w:t>4220, so this was a good salary</w:t>
-      </w:r>
-      <w:r>
-        <w:rPr>
-          <w:rFonts w:ascii="Times New Roman" w:hAnsi="Times New Roman"/>
-        </w:rPr>
-        <w:t>.]</w:t>
-      </w:r>
-    </w:p>
-    <w:p>
-      <w:pPr>
-        <w:pStyle w:val="PreformattedText"/>
-        <w:bidi w:val="0"/>
-        <w:spacing w:before="0" w:after="0"/>
-        <w:jc w:val="start"/>
-        <w:rPr>
-          <w:rFonts w:ascii="Times New Roman" w:hAnsi="Times New Roman"/>
-        </w:rPr>
-      </w:pPr>
-      <w:r>
-        <w:rPr/>
-      </w:r>
-    </w:p>
-    <w:p>
-      <w:pPr>
-        <w:pStyle w:val="PreformattedText"/>
-        <w:bidi w:val="0"/>
-        <w:spacing w:before="0" w:after="0"/>
-        <w:jc w:val="start"/>
-        <w:rPr>
-          <w:rFonts w:ascii="Times New Roman" w:hAnsi="Times New Roman"/>
-        </w:rPr>
-      </w:pPr>
-      <w:r>
-        <w:rPr>
-          <w:rFonts w:ascii="Times New Roman" w:hAnsi="Times New Roman"/>
-        </w:rPr>
-        <w:t>p</w:t>
-      </w:r>
-      <w:r>
-        <w:rPr>
-          <w:rFonts w:ascii="Times New Roman" w:hAnsi="Times New Roman"/>
-        </w:rPr>
-        <w:t>42: User-perceived benefits of EDP: speed, accuracy, improved reporting, improved organisational control, staff savings.</w:t>
+        <w:rPr>
+          <w:rFonts w:ascii="Times New Roman" w:hAnsi="Times New Roman"/>
+        </w:rPr>
+      </w:r>
+    </w:p>
+    <w:p>
+      <w:pPr>
+        <w:pStyle w:val="PreformattedText"/>
+        <w:bidi w:val="0"/>
+        <w:spacing w:before="0" w:after="0"/>
+        <w:jc w:val="start"/>
+        <w:rPr>
+          <w:rFonts w:ascii="Times New Roman" w:hAnsi="Times New Roman"/>
+        </w:rPr>
+      </w:pPr>
+      <w:r>
+        <w:rPr>
+          <w:rFonts w:ascii="Times New Roman" w:hAnsi="Times New Roman"/>
+        </w:rPr>
+        <w:t>p38: “The EDP Manager’s Profile” “He” on average is 37, recruited internally, probably qualified in accountancy, often has limited prior experience in EDP, and paid $4580NZ p.a. [According to the NZ Yearbook for 1970, the average salary for “Company directors and managers ” in 1967-68 was $4220, so this was a good salary.]</w:t>
+      </w:r>
+    </w:p>
+    <w:p>
+      <w:pPr>
+        <w:pStyle w:val="PreformattedText"/>
+        <w:bidi w:val="0"/>
+        <w:spacing w:before="0" w:after="0"/>
+        <w:jc w:val="start"/>
+        <w:rPr>
+          <w:rFonts w:ascii="Times New Roman" w:hAnsi="Times New Roman"/>
+        </w:rPr>
+      </w:pPr>
+      <w:r>
+        <w:rPr>
+          <w:rFonts w:ascii="Times New Roman" w:hAnsi="Times New Roman"/>
+        </w:rPr>
+      </w:r>
+    </w:p>
+    <w:p>
+      <w:pPr>
+        <w:pStyle w:val="PreformattedText"/>
+        <w:bidi w:val="0"/>
+        <w:spacing w:before="0" w:after="0"/>
+        <w:jc w:val="start"/>
+        <w:rPr>
+          <w:rFonts w:ascii="Times New Roman" w:hAnsi="Times New Roman"/>
+        </w:rPr>
+      </w:pPr>
+      <w:r>
+        <w:rPr>
+          <w:rFonts w:ascii="Times New Roman" w:hAnsi="Times New Roman"/>
+        </w:rPr>
+        <w:t>p42: User-perceived benefits of EDP: speed, accuracy, improved reporting, improved organisational control, staff savings.</w:t>
       </w:r>
     </w:p>
     <w:p>
@@ -13801,7 +13782,9 @@
         </w:rPr>
       </w:pPr>
       <w:r>
-        <w:rPr/>
+        <w:rPr>
+          <w:rFonts w:ascii="Times New Roman" w:hAnsi="Times New Roman"/>
+        </w:rPr>
       </w:r>
     </w:p>
     <w:p>
@@ -13849,38 +13832,42 @@
         </w:rPr>
       </w:pPr>
       <w:r>
-        <w:rPr/>
-      </w:r>
-    </w:p>
-    <w:p>
-      <w:pPr>
-        <w:pStyle w:val="PreformattedText"/>
-        <w:bidi w:val="0"/>
-        <w:spacing w:before="0" w:after="0"/>
-        <w:jc w:val="start"/>
-        <w:rPr>
-          <w:rFonts w:ascii="Times New Roman" w:hAnsi="Times New Roman"/>
-        </w:rPr>
-      </w:pPr>
-      <w:r>
-        <w:rPr>
-          <w:rFonts w:ascii="Times New Roman" w:hAnsi="Times New Roman"/>
-        </w:rPr>
-        <w:t>p85: 46% sites still on a single shift! Only 41% on two shifts regularly, and 8% on three shifts. [The Treasury was cofrrect in feeling that these expensive imports were under-utilised.]</w:t>
-      </w:r>
-    </w:p>
-    <w:p>
-      <w:pPr>
-        <w:pStyle w:val="PreformattedText"/>
-        <w:bidi w:val="0"/>
-        <w:spacing w:before="0" w:after="0"/>
-        <w:jc w:val="start"/>
-        <w:rPr>
-          <w:rFonts w:ascii="Times New Roman" w:hAnsi="Times New Roman"/>
-        </w:rPr>
-      </w:pPr>
-      <w:r>
-        <w:rPr/>
+        <w:rPr>
+          <w:rFonts w:ascii="Times New Roman" w:hAnsi="Times New Roman"/>
+        </w:rPr>
+      </w:r>
+    </w:p>
+    <w:p>
+      <w:pPr>
+        <w:pStyle w:val="PreformattedText"/>
+        <w:bidi w:val="0"/>
+        <w:spacing w:before="0" w:after="0"/>
+        <w:jc w:val="start"/>
+        <w:rPr>
+          <w:rFonts w:ascii="Times New Roman" w:hAnsi="Times New Roman"/>
+        </w:rPr>
+      </w:pPr>
+      <w:r>
+        <w:rPr>
+          <w:rFonts w:ascii="Times New Roman" w:hAnsi="Times New Roman"/>
+        </w:rPr>
+        <w:t>p85: 46% sites still on a single shift! Only 41% on two shifts regularly, and 8% on three shifts. [The Treasury was correct in feeling that these expensive imports were under-utilised.]</w:t>
+      </w:r>
+    </w:p>
+    <w:p>
+      <w:pPr>
+        <w:pStyle w:val="PreformattedText"/>
+        <w:bidi w:val="0"/>
+        <w:spacing w:before="0" w:after="0"/>
+        <w:jc w:val="start"/>
+        <w:rPr>
+          <w:rFonts w:ascii="Times New Roman" w:hAnsi="Times New Roman"/>
+        </w:rPr>
+      </w:pPr>
+      <w:r>
+        <w:rPr>
+          <w:rFonts w:ascii="Times New Roman" w:hAnsi="Times New Roman"/>
+        </w:rPr>
       </w:r>
     </w:p>
     <w:p>
@@ -13911,91 +13898,71 @@
         </w:rPr>
       </w:pPr>
       <w:r>
-        <w:rPr/>
-      </w:r>
-    </w:p>
-    <w:p>
-      <w:pPr>
-        <w:pStyle w:val="PreformattedText"/>
-        <w:bidi w:val="0"/>
-        <w:spacing w:before="0" w:after="0"/>
-        <w:jc w:val="start"/>
-        <w:rPr>
-          <w:rFonts w:ascii="Times New Roman" w:hAnsi="Times New Roman"/>
-        </w:rPr>
-      </w:pPr>
-      <w:r>
-        <w:rPr>
-          <w:rFonts w:ascii="Times New Roman" w:hAnsi="Times New Roman"/>
-        </w:rPr>
-        <w:t>p112: among  owner-users, only 68% charge internal users for usage: “one of chief reasons why installations can be uneconomic”.</w:t>
-      </w:r>
-    </w:p>
-    <w:p>
-      <w:pPr>
-        <w:pStyle w:val="PreformattedText"/>
-        <w:bidi w:val="0"/>
-        <w:spacing w:before="0" w:after="0"/>
-        <w:jc w:val="start"/>
-        <w:rPr>
-          <w:rFonts w:ascii="Times New Roman" w:hAnsi="Times New Roman"/>
-        </w:rPr>
-      </w:pPr>
-      <w:r>
-        <w:rPr/>
-      </w:r>
-    </w:p>
-    <w:p>
-      <w:pPr>
-        <w:pStyle w:val="PreformattedText"/>
-        <w:bidi w:val="0"/>
-        <w:spacing w:before="0" w:after="0"/>
-        <w:jc w:val="start"/>
-        <w:rPr>
-          <w:rFonts w:ascii="Times New Roman" w:hAnsi="Times New Roman"/>
-        </w:rPr>
-      </w:pPr>
-      <w:r>
-        <w:rPr>
-          <w:rFonts w:ascii="Times New Roman" w:hAnsi="Times New Roman"/>
-        </w:rPr>
-        <w:t>p115: shows that the survey went to 100 computer owners (claimed to be an exact coun</w:t>
-      </w:r>
-      <w:r>
-        <w:rPr>
-          <w:rFonts w:ascii="Times New Roman" w:hAnsi="Times New Roman"/>
-        </w:rPr>
-        <w:t xml:space="preserve">t </w:t>
-      </w:r>
-      <w:r>
-        <w:rPr>
-          <w:rFonts w:ascii="Times New Roman" w:hAnsi="Times New Roman"/>
-        </w:rPr>
-        <w:t>based on in</w:t>
-      </w:r>
-      <w:r>
-        <w:rPr>
-          <w:rFonts w:ascii="Times New Roman" w:hAnsi="Times New Roman"/>
-        </w:rPr>
-        <w:t>f</w:t>
-      </w:r>
-      <w:r>
-        <w:rPr>
-          <w:rFonts w:ascii="Times New Roman" w:hAnsi="Times New Roman"/>
-        </w:rPr>
-        <w:t>o f</w:t>
-      </w:r>
-      <w:r>
-        <w:rPr>
-          <w:rFonts w:ascii="Times New Roman" w:hAnsi="Times New Roman"/>
-        </w:rPr>
-        <w:t>r</w:t>
-      </w:r>
-      <w:r>
-        <w:rPr>
-          <w:rFonts w:ascii="Times New Roman" w:hAnsi="Times New Roman"/>
-        </w:rPr>
-        <w:t>om vendors)</w:t>
+        <w:rPr>
+          <w:rFonts w:ascii="Times New Roman" w:hAnsi="Times New Roman"/>
+        </w:rPr>
+      </w:r>
+    </w:p>
+    <w:p>
+      <w:pPr>
+        <w:pStyle w:val="PreformattedText"/>
+        <w:bidi w:val="0"/>
+        <w:spacing w:before="0" w:after="0"/>
+        <w:jc w:val="start"/>
+        <w:rPr>
+          <w:rFonts w:ascii="Times New Roman" w:hAnsi="Times New Roman"/>
+        </w:rPr>
+      </w:pPr>
+      <w:r>
+        <w:rPr>
+          <w:rFonts w:ascii="Times New Roman" w:hAnsi="Times New Roman"/>
+        </w:rPr>
+        <w:t xml:space="preserve">p112: among  owner-users, only 68% charge internal users for usage: “one of </w:t>
+      </w:r>
+      <w:r>
+        <w:rPr>
+          <w:rFonts w:ascii="Times New Roman" w:hAnsi="Times New Roman"/>
+        </w:rPr>
+        <w:t xml:space="preserve">the </w:t>
+      </w:r>
+      <w:r>
+        <w:rPr>
+          <w:rFonts w:ascii="Times New Roman" w:hAnsi="Times New Roman"/>
+        </w:rPr>
+        <w:t>chief reasons why installations can be uneconomic”.</w:t>
+      </w:r>
+    </w:p>
+    <w:p>
+      <w:pPr>
+        <w:pStyle w:val="PreformattedText"/>
+        <w:bidi w:val="0"/>
+        <w:spacing w:before="0" w:after="0"/>
+        <w:jc w:val="start"/>
+        <w:rPr>
+          <w:rFonts w:ascii="Times New Roman" w:hAnsi="Times New Roman"/>
+        </w:rPr>
+      </w:pPr>
+      <w:r>
+        <w:rPr>
+          <w:rFonts w:ascii="Times New Roman" w:hAnsi="Times New Roman"/>
+        </w:rPr>
+      </w:r>
+    </w:p>
+    <w:p>
+      <w:pPr>
+        <w:pStyle w:val="PreformattedText"/>
+        <w:bidi w:val="0"/>
+        <w:spacing w:before="0" w:after="0"/>
+        <w:jc w:val="start"/>
+        <w:rPr>
+          <w:rFonts w:ascii="Times New Roman" w:hAnsi="Times New Roman"/>
+        </w:rPr>
+      </w:pPr>
+      <w:r>
+        <w:rPr>
+          <w:rFonts w:ascii="Times New Roman" w:hAnsi="Times New Roman"/>
+        </w:rPr>
+        <w:t>p115: shows that the survey went to 100 computer owners (claimed to be an exact count based on info from vendors)</w:t>
       </w:r>
     </w:p>
     <w:p>
@@ -14026,7 +13993,9 @@
         </w:rPr>
       </w:pPr>
       <w:r>
-        <w:rPr/>
+        <w:rPr>
+          <w:rFonts w:ascii="Times New Roman" w:hAnsi="Times New Roman"/>
+        </w:rPr>
       </w:r>
     </w:p>
     <w:p>

</xml_diff>

<commit_message>
Added info on ownership, Ceramco picture
</commit_message>
<xml_diff>
--- a/Brian-notes-from-sources.docx
+++ b/Brian-notes-from-sources.docx
@@ -13699,6 +13699,37 @@
         </w:rPr>
       </w:pPr>
       <w:r>
+        <w:rPr/>
+      </w:r>
+    </w:p>
+    <w:p>
+      <w:pPr>
+        <w:pStyle w:val="PreformattedText"/>
+        <w:bidi w:val="0"/>
+        <w:spacing w:before="0" w:after="0"/>
+        <w:jc w:val="start"/>
+        <w:rPr>
+          <w:rFonts w:ascii="Times New Roman" w:hAnsi="Times New Roman"/>
+        </w:rPr>
+      </w:pPr>
+      <w:r>
+        <w:rPr>
+          <w:rFonts w:ascii="Times New Roman" w:hAnsi="Times New Roman"/>
+        </w:rPr>
+        <w:t>p30: [The report distinguishes between “owners” with their own computer and “users” who use bureau services]. 70% of owners actually rented their equipment in 1967, 15% purchased outright, 15% purchased some and rented some.</w:t>
+      </w:r>
+    </w:p>
+    <w:p>
+      <w:pPr>
+        <w:pStyle w:val="PreformattedText"/>
+        <w:bidi w:val="0"/>
+        <w:spacing w:before="0" w:after="0"/>
+        <w:jc w:val="start"/>
+        <w:rPr>
+          <w:rFonts w:ascii="Times New Roman" w:hAnsi="Times New Roman"/>
+        </w:rPr>
+      </w:pPr>
+      <w:r>
         <w:rPr>
           <w:rFonts w:ascii="Times New Roman" w:hAnsi="Times New Roman"/>
         </w:rPr>
@@ -13917,19 +13948,7 @@
         <w:rPr>
           <w:rFonts w:ascii="Times New Roman" w:hAnsi="Times New Roman"/>
         </w:rPr>
-        <w:t xml:space="preserve">p112: among  owner-users, only 68% charge internal users for usage: “one of </w:t>
-      </w:r>
-      <w:r>
-        <w:rPr>
-          <w:rFonts w:ascii="Times New Roman" w:hAnsi="Times New Roman"/>
-        </w:rPr>
-        <w:t xml:space="preserve">the </w:t>
-      </w:r>
-      <w:r>
-        <w:rPr>
-          <w:rFonts w:ascii="Times New Roman" w:hAnsi="Times New Roman"/>
-        </w:rPr>
-        <w:t>chief reasons why installations can be uneconomic”.</w:t>
+        <w:t>p112: among  owner-users, only 68% charge internal users for usage: “one of the chief reasons why installations can be uneconomic”.</w:t>
       </w:r>
     </w:p>
     <w:p>
@@ -14068,7 +14087,7 @@
     </w:r>
     <w:r>
       <w:rPr/>
-      <w:t>20</w:t>
+      <w:t>12</w:t>
     </w:r>
     <w:r>
       <w:rPr/>

</xml_diff>

<commit_message>
More notes on 1967 survey
</commit_message>
<xml_diff>
--- a/Brian-notes-from-sources.docx
+++ b/Brian-notes-from-sources.docx
@@ -560,7 +560,7 @@
               <w:rPr>
                 <w:rStyle w:val="IndexLink"/>
               </w:rPr>
-              <w:t>Still to be studied</w:t>
+              <w:t>Scott Survey 1967</w:t>
               <w:tab/>
               <w:t>19</w:t>
             </w:r>
@@ -13699,7 +13699,9 @@
         </w:rPr>
       </w:pPr>
       <w:r>
-        <w:rPr/>
+        <w:rPr>
+          <w:rFonts w:ascii="Times New Roman" w:hAnsi="Times New Roman"/>
+        </w:rPr>
       </w:r>
     </w:p>
     <w:p>
@@ -13850,6 +13852,153 @@
           <w:rFonts w:ascii="Times New Roman" w:hAnsi="Times New Roman"/>
         </w:rPr>
         <w:t>p82: Operating hours per month average 250  (1966: 165) (1968 planned: 276)</w:t>
+      </w:r>
+    </w:p>
+    <w:p>
+      <w:pPr>
+        <w:pStyle w:val="PreformattedText"/>
+        <w:bidi w:val="0"/>
+        <w:spacing w:before="0" w:after="0"/>
+        <w:jc w:val="start"/>
+        <w:rPr>
+          <w:rFonts w:ascii="Times New Roman" w:hAnsi="Times New Roman"/>
+        </w:rPr>
+      </w:pPr>
+      <w:r>
+        <w:rPr/>
+      </w:r>
+    </w:p>
+    <w:p>
+      <w:pPr>
+        <w:pStyle w:val="PreformattedText"/>
+        <w:bidi w:val="0"/>
+        <w:spacing w:before="0" w:after="0"/>
+        <w:jc w:val="start"/>
+        <w:rPr>
+          <w:rFonts w:ascii="Times New Roman" w:hAnsi="Times New Roman"/>
+        </w:rPr>
+      </w:pPr>
+      <w:r>
+        <w:rPr>
+          <w:rFonts w:ascii="Times New Roman" w:hAnsi="Times New Roman"/>
+        </w:rPr>
+        <w:t>p76: 25% sites say software was not available when needed; 30% were limited by “store size”.</w:t>
+      </w:r>
+    </w:p>
+    <w:p>
+      <w:pPr>
+        <w:pStyle w:val="PreformattedText"/>
+        <w:bidi w:val="0"/>
+        <w:spacing w:before="0" w:after="0"/>
+        <w:jc w:val="start"/>
+        <w:rPr>
+          <w:rFonts w:ascii="Times New Roman" w:hAnsi="Times New Roman"/>
+        </w:rPr>
+      </w:pPr>
+      <w:r>
+        <w:rPr>
+          <w:rFonts w:ascii="Times New Roman" w:hAnsi="Times New Roman"/>
+        </w:rPr>
+        <w:t>(“8k adequate for most needs – 16k necessary for greater sophistication.”)</w:t>
+      </w:r>
+    </w:p>
+    <w:p>
+      <w:pPr>
+        <w:pStyle w:val="PreformattedText"/>
+        <w:bidi w:val="0"/>
+        <w:spacing w:before="0" w:after="0"/>
+        <w:jc w:val="start"/>
+        <w:rPr>
+          <w:rFonts w:ascii="Times New Roman" w:hAnsi="Times New Roman"/>
+        </w:rPr>
+      </w:pPr>
+      <w:r>
+        <w:rPr/>
+      </w:r>
+    </w:p>
+    <w:p>
+      <w:pPr>
+        <w:pStyle w:val="PreformattedText"/>
+        <w:bidi w:val="0"/>
+        <w:spacing w:before="0" w:after="0"/>
+        <w:jc w:val="start"/>
+        <w:rPr>
+          <w:rFonts w:ascii="Times New Roman" w:hAnsi="Times New Roman"/>
+        </w:rPr>
+      </w:pPr>
+      <w:r>
+        <w:rPr>
+          <w:rFonts w:ascii="Times New Roman" w:hAnsi="Times New Roman"/>
+        </w:rPr>
+        <w:t>p77: Programming languages in use:</w:t>
+        <w:br/>
+        <w:t xml:space="preserve"> Fortran 32%, Cobol 28%, RPG 26%, Algol 8%, etc.</w:t>
+      </w:r>
+    </w:p>
+    <w:p>
+      <w:pPr>
+        <w:pStyle w:val="PreformattedText"/>
+        <w:bidi w:val="0"/>
+        <w:spacing w:before="0" w:after="0"/>
+        <w:jc w:val="start"/>
+        <w:rPr>
+          <w:rFonts w:ascii="Times New Roman" w:hAnsi="Times New Roman"/>
+        </w:rPr>
+      </w:pPr>
+      <w:r>
+        <w:rPr>
+          <w:rFonts w:ascii="Times New Roman" w:hAnsi="Times New Roman"/>
+        </w:rPr>
+        <w:t xml:space="preserve"> </w:t>
+      </w:r>
+      <w:r>
+        <w:rPr>
+          <w:rFonts w:ascii="Times New Roman" w:hAnsi="Times New Roman"/>
+        </w:rPr>
+        <w:t>Assembler, Autocoder, Plan, MPL, etc.</w:t>
+      </w:r>
+    </w:p>
+    <w:p>
+      <w:pPr>
+        <w:pStyle w:val="PreformattedText"/>
+        <w:bidi w:val="0"/>
+        <w:spacing w:before="0" w:after="0"/>
+        <w:jc w:val="start"/>
+        <w:rPr>
+          <w:rFonts w:ascii="Times New Roman" w:hAnsi="Times New Roman"/>
+        </w:rPr>
+      </w:pPr>
+      <w:r>
+        <w:rPr/>
+      </w:r>
+    </w:p>
+    <w:p>
+      <w:pPr>
+        <w:pStyle w:val="PreformattedText"/>
+        <w:bidi w:val="0"/>
+        <w:spacing w:before="0" w:after="0"/>
+        <w:jc w:val="start"/>
+        <w:rPr>
+          <w:rFonts w:ascii="Times New Roman" w:hAnsi="Times New Roman"/>
+        </w:rPr>
+      </w:pPr>
+      <w:r>
+        <w:rPr>
+          <w:rFonts w:ascii="Times New Roman" w:hAnsi="Times New Roman"/>
+        </w:rPr>
+        <w:t>p79: Two-thirds of sites use no package software (i.e. all home-grown software). 25 packages reported by other sites, with “PERT” the most common. [Presumably this refers to ICT’s PERT (</w:t>
+      </w:r>
+      <w:r>
+        <w:rPr>
+          <w:rFonts w:ascii="Times New Roman" w:hAnsi="Times New Roman"/>
+        </w:rPr>
+        <w:t>project evaluation and review technique</w:t>
+      </w:r>
+      <w:r>
+        <w:rPr>
+          <w:rFonts w:ascii="Times New Roman" w:hAnsi="Times New Roman"/>
+        </w:rPr>
+        <w:t>) product for project planning, originated in 1962.]</w:t>
       </w:r>
     </w:p>
     <w:p>
@@ -14087,7 +14236,7 @@
     </w:r>
     <w:r>
       <w:rPr/>
-      <w:t>12</w:t>
+      <w:t>20</w:t>
     </w:r>
     <w:r>
       <w:rPr/>

</xml_diff>

<commit_message>
More details from Otago history
</commit_message>
<xml_diff>
--- a/Brian-notes-from-sources.docx
+++ b/Brian-notes-from-sources.docx
@@ -186,6 +186,9 @@
         <w:p>
           <w:pPr>
             <w:pStyle w:val="TOC3"/>
+            <w:tabs>
+              <w:tab w:val="right" w:pos="9972" w:leader="dot"/>
+            </w:tabs>
             <w:rPr/>
           </w:pPr>
           <w:r>
@@ -217,6 +220,9 @@
         <w:p>
           <w:pPr>
             <w:pStyle w:val="TOC3"/>
+            <w:tabs>
+              <w:tab w:val="right" w:pos="9972" w:leader="dot"/>
+            </w:tabs>
             <w:rPr/>
           </w:pPr>
           <w:hyperlink w:anchor="__RefHeading___Toc625_3890210930">
@@ -233,6 +239,9 @@
         <w:p>
           <w:pPr>
             <w:pStyle w:val="TOC3"/>
+            <w:tabs>
+              <w:tab w:val="right" w:pos="9972" w:leader="dot"/>
+            </w:tabs>
             <w:rPr/>
           </w:pPr>
           <w:hyperlink w:anchor="__RefHeading___Toc745_4069786829">
@@ -249,6 +258,9 @@
         <w:p>
           <w:pPr>
             <w:pStyle w:val="TOC3"/>
+            <w:tabs>
+              <w:tab w:val="right" w:pos="9972" w:leader="dot"/>
+            </w:tabs>
             <w:rPr/>
           </w:pPr>
           <w:hyperlink w:anchor="__RefHeading___Toc10_2088807118">
@@ -265,6 +277,9 @@
         <w:p>
           <w:pPr>
             <w:pStyle w:val="TOC3"/>
+            <w:tabs>
+              <w:tab w:val="right" w:pos="9972" w:leader="dot"/>
+            </w:tabs>
             <w:rPr/>
           </w:pPr>
           <w:hyperlink w:anchor="__RefHeading___Toc12_2088807118">
@@ -281,6 +296,9 @@
         <w:p>
           <w:pPr>
             <w:pStyle w:val="TOC3"/>
+            <w:tabs>
+              <w:tab w:val="right" w:pos="9972" w:leader="dot"/>
+            </w:tabs>
             <w:rPr/>
           </w:pPr>
           <w:hyperlink w:anchor="__RefHeading___Toc14_2088807118">
@@ -297,6 +315,9 @@
         <w:p>
           <w:pPr>
             <w:pStyle w:val="TOC3"/>
+            <w:tabs>
+              <w:tab w:val="right" w:pos="9972" w:leader="dot"/>
+            </w:tabs>
             <w:rPr/>
           </w:pPr>
           <w:hyperlink w:anchor="__RefHeading___Toc16_2088807118">
@@ -313,6 +334,9 @@
         <w:p>
           <w:pPr>
             <w:pStyle w:val="TOC3"/>
+            <w:tabs>
+              <w:tab w:val="right" w:pos="9972" w:leader="dot"/>
+            </w:tabs>
             <w:rPr/>
           </w:pPr>
           <w:hyperlink w:anchor="__RefHeading___Toc18_2088807118">
@@ -329,6 +353,9 @@
         <w:p>
           <w:pPr>
             <w:pStyle w:val="TOC3"/>
+            <w:tabs>
+              <w:tab w:val="right" w:pos="9972" w:leader="dot"/>
+            </w:tabs>
             <w:rPr/>
           </w:pPr>
           <w:hyperlink w:anchor="__RefHeading___Toc20_2088807118">
@@ -345,6 +372,9 @@
         <w:p>
           <w:pPr>
             <w:pStyle w:val="TOC3"/>
+            <w:tabs>
+              <w:tab w:val="right" w:pos="9972" w:leader="dot"/>
+            </w:tabs>
             <w:rPr/>
           </w:pPr>
           <w:hyperlink w:anchor="__RefHeading___Toc22_2088807118">
@@ -361,6 +391,9 @@
         <w:p>
           <w:pPr>
             <w:pStyle w:val="TOC3"/>
+            <w:tabs>
+              <w:tab w:val="right" w:pos="9972" w:leader="dot"/>
+            </w:tabs>
             <w:rPr/>
           </w:pPr>
           <w:hyperlink w:anchor="__RefHeading___Toc24_2088807118">
@@ -377,6 +410,9 @@
         <w:p>
           <w:pPr>
             <w:pStyle w:val="TOC3"/>
+            <w:tabs>
+              <w:tab w:val="right" w:pos="9972" w:leader="dot"/>
+            </w:tabs>
             <w:rPr/>
           </w:pPr>
           <w:hyperlink w:anchor="__RefHeading___Toc26_2088807118">
@@ -393,6 +429,9 @@
         <w:p>
           <w:pPr>
             <w:pStyle w:val="TOC3"/>
+            <w:tabs>
+              <w:tab w:val="right" w:pos="9972" w:leader="dot"/>
+            </w:tabs>
             <w:rPr/>
           </w:pPr>
           <w:hyperlink w:anchor="__RefHeading___Toc28_2088807118">
@@ -409,6 +448,9 @@
         <w:p>
           <w:pPr>
             <w:pStyle w:val="TOC3"/>
+            <w:tabs>
+              <w:tab w:val="right" w:pos="9972" w:leader="dot"/>
+            </w:tabs>
             <w:rPr/>
           </w:pPr>
           <w:hyperlink w:anchor="__RefHeading___Toc30_2088807118">
@@ -425,6 +467,9 @@
         <w:p>
           <w:pPr>
             <w:pStyle w:val="TOC3"/>
+            <w:tabs>
+              <w:tab w:val="right" w:pos="9972" w:leader="dot"/>
+            </w:tabs>
             <w:rPr/>
           </w:pPr>
           <w:hyperlink w:anchor="__RefHeading___Toc32_2088807118">
@@ -441,6 +486,9 @@
         <w:p>
           <w:pPr>
             <w:pStyle w:val="TOC3"/>
+            <w:tabs>
+              <w:tab w:val="right" w:pos="9972" w:leader="dot"/>
+            </w:tabs>
             <w:rPr/>
           </w:pPr>
           <w:hyperlink w:anchor="__RefHeading___Toc34_2088807118">
@@ -457,6 +505,9 @@
         <w:p>
           <w:pPr>
             <w:pStyle w:val="TOC3"/>
+            <w:tabs>
+              <w:tab w:val="right" w:pos="9972" w:leader="dot"/>
+            </w:tabs>
             <w:rPr/>
           </w:pPr>
           <w:hyperlink w:anchor="__RefHeading___Toc36_2088807118">
@@ -473,6 +524,9 @@
         <w:p>
           <w:pPr>
             <w:pStyle w:val="TOC3"/>
+            <w:tabs>
+              <w:tab w:val="right" w:pos="9972" w:leader="dot"/>
+            </w:tabs>
             <w:rPr/>
           </w:pPr>
           <w:hyperlink w:anchor="__RefHeading___Toc38_2088807118">
@@ -489,6 +543,9 @@
         <w:p>
           <w:pPr>
             <w:pStyle w:val="TOC3"/>
+            <w:tabs>
+              <w:tab w:val="right" w:pos="9972" w:leader="dot"/>
+            </w:tabs>
             <w:rPr/>
           </w:pPr>
           <w:hyperlink w:anchor="__RefHeading___Toc47_2088807118">
@@ -505,6 +562,9 @@
         <w:p>
           <w:pPr>
             <w:pStyle w:val="TOC3"/>
+            <w:tabs>
+              <w:tab w:val="right" w:pos="9972" w:leader="dot"/>
+            </w:tabs>
             <w:rPr/>
           </w:pPr>
           <w:hyperlink w:anchor="__RefHeading___Toc42_2088807118">
@@ -521,6 +581,9 @@
         <w:p>
           <w:pPr>
             <w:pStyle w:val="TOC3"/>
+            <w:tabs>
+              <w:tab w:val="right" w:pos="9972" w:leader="dot"/>
+            </w:tabs>
             <w:rPr/>
           </w:pPr>
           <w:hyperlink w:anchor="__RefHeading___Toc627_3890210930">
@@ -537,6 +600,9 @@
         <w:p>
           <w:pPr>
             <w:pStyle w:val="TOC3"/>
+            <w:tabs>
+              <w:tab w:val="right" w:pos="9972" w:leader="dot"/>
+            </w:tabs>
             <w:rPr/>
           </w:pPr>
           <w:hyperlink w:anchor="__RefHeading___Toc44_2088807118">
@@ -553,6 +619,9 @@
         <w:p>
           <w:pPr>
             <w:pStyle w:val="TOC3"/>
+            <w:tabs>
+              <w:tab w:val="right" w:pos="9972" w:leader="dot"/>
+            </w:tabs>
             <w:rPr/>
           </w:pPr>
           <w:hyperlink w:anchor="__RefHeading___Toc844_103235316">
@@ -563,6 +632,44 @@
               <w:t>Scott Survey 1967</w:t>
               <w:tab/>
               <w:t>19</w:t>
+            </w:r>
+          </w:hyperlink>
+        </w:p>
+        <w:p>
+          <w:pPr>
+            <w:pStyle w:val="TOC3"/>
+            <w:tabs>
+              <w:tab w:val="right" w:pos="9972" w:leader="dot"/>
+            </w:tabs>
+            <w:rPr/>
+          </w:pPr>
+          <w:hyperlink w:anchor="__RefHeading___Toc923_2293712919">
+            <w:r>
+              <w:rPr>
+                <w:rStyle w:val="IndexLink"/>
+              </w:rPr>
+              <w:t>NZ Naval Report to the Defence Council – 1968</w:t>
+              <w:tab/>
+              <w:t>20</w:t>
+            </w:r>
+          </w:hyperlink>
+        </w:p>
+        <w:p>
+          <w:pPr>
+            <w:pStyle w:val="TOC3"/>
+            <w:tabs>
+              <w:tab w:val="right" w:pos="9972" w:leader="dot"/>
+            </w:tabs>
+            <w:rPr/>
+          </w:pPr>
+          <w:hyperlink w:anchor="__RefHeading___Toc925_2293712919">
+            <w:r>
+              <w:rPr>
+                <w:rStyle w:val="IndexLink"/>
+              </w:rPr>
+              <w:t>History of CS at Otago</w:t>
+              <w:tab/>
+              <w:t>20</w:t>
             </w:r>
           </w:hyperlink>
           <w:r>
@@ -13865,7 +13972,9 @@
         </w:rPr>
       </w:pPr>
       <w:r>
-        <w:rPr/>
+        <w:rPr>
+          <w:rFonts w:ascii="Times New Roman" w:hAnsi="Times New Roman"/>
+        </w:rPr>
       </w:r>
     </w:p>
     <w:p>
@@ -13913,7 +14022,9 @@
         </w:rPr>
       </w:pPr>
       <w:r>
-        <w:rPr/>
+        <w:rPr>
+          <w:rFonts w:ascii="Times New Roman" w:hAnsi="Times New Roman"/>
+        </w:rPr>
       </w:r>
     </w:p>
     <w:p>
@@ -13969,36 +14080,26 @@
         </w:rPr>
       </w:pPr>
       <w:r>
-        <w:rPr/>
-      </w:r>
-    </w:p>
-    <w:p>
-      <w:pPr>
-        <w:pStyle w:val="PreformattedText"/>
-        <w:bidi w:val="0"/>
-        <w:spacing w:before="0" w:after="0"/>
-        <w:jc w:val="start"/>
-        <w:rPr>
-          <w:rFonts w:ascii="Times New Roman" w:hAnsi="Times New Roman"/>
-        </w:rPr>
-      </w:pPr>
-      <w:r>
-        <w:rPr>
-          <w:rFonts w:ascii="Times New Roman" w:hAnsi="Times New Roman"/>
-        </w:rPr>
-        <w:t>p79: Two-thirds of sites use no package software (i.e. all home-grown software). 25 packages reported by other sites, with “PERT” the most common. [Presumably this refers to ICT’s PERT (</w:t>
-      </w:r>
-      <w:r>
-        <w:rPr>
-          <w:rFonts w:ascii="Times New Roman" w:hAnsi="Times New Roman"/>
-        </w:rPr>
-        <w:t>project evaluation and review technique</w:t>
-      </w:r>
-      <w:r>
-        <w:rPr>
-          <w:rFonts w:ascii="Times New Roman" w:hAnsi="Times New Roman"/>
-        </w:rPr>
-        <w:t>) product for project planning, originated in 1962.]</w:t>
+        <w:rPr>
+          <w:rFonts w:ascii="Times New Roman" w:hAnsi="Times New Roman"/>
+        </w:rPr>
+      </w:r>
+    </w:p>
+    <w:p>
+      <w:pPr>
+        <w:pStyle w:val="PreformattedText"/>
+        <w:bidi w:val="0"/>
+        <w:spacing w:before="0" w:after="0"/>
+        <w:jc w:val="start"/>
+        <w:rPr>
+          <w:rFonts w:ascii="Times New Roman" w:hAnsi="Times New Roman"/>
+        </w:rPr>
+      </w:pPr>
+      <w:r>
+        <w:rPr>
+          <w:rFonts w:ascii="Times New Roman" w:hAnsi="Times New Roman"/>
+        </w:rPr>
+        <w:t>p79: Two-thirds of sites use no package software (i.e. all home-grown software). 25 packages reported by other sites, with “PERT” the most common. [Presumably this refers to ICT’s PERT (project evaluation and review technique) product for project planning, originated in 1962.]</w:t>
       </w:r>
     </w:p>
     <w:p>
@@ -14182,20 +14283,545 @@
         </w:rPr>
         <w:t>No count of the existing bureaus was found, but p121 notes that there is rapid growth in the number of non-vendor bureaus since 1966, with their total user count increasing from 33 to 78 and a corresponding decrease in the user count for vendor-operated bureaus.</w:t>
       </w:r>
-    </w:p>
-    <w:p>
-      <w:pPr>
-        <w:pStyle w:val="PreformattedText"/>
-        <w:bidi w:val="0"/>
-        <w:spacing w:before="0" w:after="0"/>
-        <w:jc w:val="start"/>
-        <w:rPr>
-          <w:rFonts w:ascii="Times New Roman" w:hAnsi="Times New Roman"/>
-        </w:rPr>
-      </w:pPr>
-      <w:r>
-        <w:rPr/>
-        <w:t xml:space="preserve">                                           </w:t>
+      <w:r>
+        <w:rPr/>
+        <w:t xml:space="preserve">                                        </w:t>
+      </w:r>
+    </w:p>
+    <w:p>
+      <w:pPr>
+        <w:pStyle w:val="PreformattedText"/>
+        <w:bidi w:val="0"/>
+        <w:spacing w:before="0" w:after="0"/>
+        <w:jc w:val="start"/>
+        <w:rPr>
+          <w:rFonts w:ascii="Times New Roman" w:hAnsi="Times New Roman"/>
+        </w:rPr>
+      </w:pPr>
+      <w:r>
+        <w:rPr/>
+        <w:t xml:space="preserve"> </w:t>
+      </w:r>
+    </w:p>
+    <w:p>
+      <w:pPr>
+        <w:pStyle w:val="Heading3"/>
+        <w:numPr>
+          <w:ilvl w:val="0"/>
+          <w:numId w:val="0"/>
+        </w:numPr>
+        <w:ind w:hanging="0" w:start="0"/>
+        <w:rPr/>
+      </w:pPr>
+      <w:bookmarkStart w:id="24" w:name="__RefHeading___Toc923_2293712919"/>
+      <w:bookmarkEnd w:id="24"/>
+      <w:r>
+        <w:rPr/>
+        <w:t xml:space="preserve">NZ Naval Report to the Defence Council – 1968 </w:t>
+      </w:r>
+    </w:p>
+    <w:p>
+      <w:pPr>
+        <w:pStyle w:val="PreformattedText"/>
+        <w:bidi w:val="0"/>
+        <w:spacing w:before="0" w:after="0"/>
+        <w:jc w:val="start"/>
+        <w:rPr>
+          <w:rFonts w:ascii="Times New Roman" w:hAnsi="Times New Roman"/>
+        </w:rPr>
+      </w:pPr>
+      <w:r>
+        <w:rPr>
+          <w:rFonts w:ascii="Times New Roman" w:hAnsi="Times New Roman"/>
+        </w:rPr>
+      </w:r>
+    </w:p>
+    <w:p>
+      <w:pPr>
+        <w:pStyle w:val="PreformattedText"/>
+        <w:bidi w:val="0"/>
+        <w:spacing w:before="0" w:after="0"/>
+        <w:jc w:val="start"/>
+        <w:rPr>
+          <w:rFonts w:ascii="Times New Roman" w:hAnsi="Times New Roman"/>
+        </w:rPr>
+      </w:pPr>
+      <w:r>
+        <w:rPr>
+          <w:rFonts w:ascii="Times New Roman" w:hAnsi="Times New Roman"/>
+        </w:rPr>
+        <w:t>(extract at https://rnzncomms.org/dc-1968/)</w:t>
+      </w:r>
+    </w:p>
+    <w:p>
+      <w:pPr>
+        <w:pStyle w:val="PreformattedText"/>
+        <w:bidi w:val="0"/>
+        <w:spacing w:before="0" w:after="0"/>
+        <w:jc w:val="start"/>
+        <w:rPr>
+          <w:rFonts w:ascii="Times New Roman" w:hAnsi="Times New Roman"/>
+        </w:rPr>
+      </w:pPr>
+      <w:r>
+        <w:rPr>
+          <w:rFonts w:ascii="Times New Roman" w:hAnsi="Times New Roman"/>
+        </w:rPr>
+      </w:r>
+    </w:p>
+    <w:p>
+      <w:pPr>
+        <w:pStyle w:val="PreformattedText"/>
+        <w:bidi w:val="0"/>
+        <w:spacing w:before="0" w:after="0"/>
+        <w:jc w:val="start"/>
+        <w:rPr>
+          <w:rFonts w:ascii="Times New Roman" w:hAnsi="Times New Roman"/>
+        </w:rPr>
+      </w:pPr>
+      <w:r>
+        <w:rPr>
+          <w:rFonts w:ascii="Times New Roman" w:hAnsi="Times New Roman"/>
+        </w:rPr>
+        <w:t>“</w:t>
+      </w:r>
+      <w:r>
+        <w:rPr>
+          <w:rFonts w:ascii="Times New Roman" w:hAnsi="Times New Roman"/>
+        </w:rPr>
+        <w:t xml:space="preserve">All Naval Dockyard stack records are now converted to mechanised machine accounting as a basis far computer input. Electronic data processing systems already effective in HMNZS Otago and HMNZS Taranaki will be extended to other ships and establishments as soon as practicable.” </w:t>
+      </w:r>
+    </w:p>
+    <w:p>
+      <w:pPr>
+        <w:pStyle w:val="PreformattedText"/>
+        <w:bidi w:val="0"/>
+        <w:spacing w:before="0" w:after="0"/>
+        <w:jc w:val="start"/>
+        <w:rPr>
+          <w:rFonts w:ascii="Times New Roman" w:hAnsi="Times New Roman"/>
+        </w:rPr>
+      </w:pPr>
+      <w:r>
+        <w:rPr/>
+      </w:r>
+    </w:p>
+    <w:p>
+      <w:pPr>
+        <w:pStyle w:val="Heading3"/>
+        <w:numPr>
+          <w:ilvl w:val="2"/>
+          <w:numId w:val="1"/>
+        </w:numPr>
+        <w:ind w:hanging="0" w:start="0"/>
+        <w:rPr/>
+      </w:pPr>
+      <w:bookmarkStart w:id="25" w:name="__RefHeading___Toc925_2293712919"/>
+      <w:bookmarkEnd w:id="25"/>
+      <w:r>
+        <w:rPr/>
+        <w:t>History of CS at Otago</w:t>
+      </w:r>
+    </w:p>
+    <w:p>
+      <w:pPr>
+        <w:pStyle w:val="PreformattedText"/>
+        <w:bidi w:val="0"/>
+        <w:spacing w:before="0" w:after="0"/>
+        <w:jc w:val="start"/>
+        <w:rPr>
+          <w:rFonts w:ascii="Times New Roman" w:hAnsi="Times New Roman"/>
+        </w:rPr>
+      </w:pPr>
+      <w:r>
+        <w:rPr/>
+      </w:r>
+    </w:p>
+    <w:p>
+      <w:pPr>
+        <w:pStyle w:val="BodyText"/>
+        <w:bidi w:val="0"/>
+        <w:spacing w:before="0" w:after="0"/>
+        <w:jc w:val="start"/>
+        <w:rPr/>
+      </w:pPr>
+      <w:r>
+        <w:rPr>
+          <w:rFonts w:ascii="Consolas" w:hAnsi="Consolas"/>
+          <w:sz w:val="20"/>
+          <w:szCs w:val="20"/>
+        </w:rPr>
+        <w:t>@book{Otago-history,</w:t>
+      </w:r>
+    </w:p>
+    <w:p>
+      <w:pPr>
+        <w:pStyle w:val="BodyText"/>
+        <w:bidi w:val="0"/>
+        <w:spacing w:before="0" w:after="0"/>
+        <w:jc w:val="start"/>
+        <w:rPr>
+          <w:rFonts w:ascii="Consolas" w:hAnsi="Consolas"/>
+          <w:sz w:val="20"/>
+          <w:szCs w:val="20"/>
+        </w:rPr>
+      </w:pPr>
+      <w:r>
+        <w:rPr>
+          <w:rFonts w:ascii="Consolas" w:hAnsi="Consolas"/>
+          <w:sz w:val="20"/>
+          <w:szCs w:val="20"/>
+        </w:rPr>
+        <w:t>title = {{The History of Computer Science at the University of Otago}},</w:t>
+      </w:r>
+    </w:p>
+    <w:p>
+      <w:pPr>
+        <w:pStyle w:val="BodyText"/>
+        <w:bidi w:val="0"/>
+        <w:spacing w:before="0" w:after="0"/>
+        <w:jc w:val="start"/>
+        <w:rPr>
+          <w:rFonts w:ascii="Consolas" w:hAnsi="Consolas"/>
+          <w:sz w:val="20"/>
+          <w:szCs w:val="20"/>
+        </w:rPr>
+      </w:pPr>
+      <w:r>
+        <w:rPr>
+          <w:rFonts w:ascii="Consolas" w:hAnsi="Consolas"/>
+          <w:sz w:val="20"/>
+          <w:szCs w:val="20"/>
+        </w:rPr>
+        <w:t>authoror = {Labuschagne, Willem and Pollock, Robert and Lousberg, Marjan Marie},</w:t>
+      </w:r>
+    </w:p>
+    <w:p>
+      <w:pPr>
+        <w:pStyle w:val="BodyText"/>
+        <w:bidi w:val="0"/>
+        <w:spacing w:before="0" w:after="0"/>
+        <w:jc w:val="start"/>
+        <w:rPr>
+          <w:rFonts w:ascii="Consolas" w:hAnsi="Consolas"/>
+          <w:sz w:val="20"/>
+          <w:szCs w:val="20"/>
+        </w:rPr>
+      </w:pPr>
+      <w:r>
+        <w:rPr>
+          <w:rFonts w:ascii="Consolas" w:hAnsi="Consolas"/>
+          <w:sz w:val="20"/>
+          <w:szCs w:val="20"/>
+        </w:rPr>
+        <w:t>year = "2009",</w:t>
+      </w:r>
+    </w:p>
+    <w:p>
+      <w:pPr>
+        <w:pStyle w:val="BodyText"/>
+        <w:bidi w:val="0"/>
+        <w:spacing w:before="0" w:after="0"/>
+        <w:jc w:val="start"/>
+        <w:rPr>
+          <w:rFonts w:ascii="Consolas" w:hAnsi="Consolas"/>
+          <w:sz w:val="20"/>
+          <w:szCs w:val="20"/>
+        </w:rPr>
+      </w:pPr>
+      <w:r>
+        <w:rPr>
+          <w:rFonts w:ascii="Consolas" w:hAnsi="Consolas"/>
+          <w:sz w:val="20"/>
+          <w:szCs w:val="20"/>
+        </w:rPr>
+        <w:t>isbn = "9780473155926",</w:t>
+      </w:r>
+    </w:p>
+    <w:p>
+      <w:pPr>
+        <w:pStyle w:val="BodyText"/>
+        <w:bidi w:val="0"/>
+        <w:spacing w:before="0" w:after="0"/>
+        <w:jc w:val="start"/>
+        <w:rPr>
+          <w:rFonts w:ascii="Consolas" w:hAnsi="Consolas"/>
+          <w:sz w:val="20"/>
+          <w:szCs w:val="20"/>
+        </w:rPr>
+      </w:pPr>
+      <w:r>
+        <w:rPr>
+          <w:rFonts w:ascii="Consolas" w:hAnsi="Consolas"/>
+          <w:sz w:val="20"/>
+          <w:szCs w:val="20"/>
+        </w:rPr>
+        <w:t>place = {{Dunedin, New Zealand}},</w:t>
+      </w:r>
+    </w:p>
+    <w:p>
+      <w:pPr>
+        <w:pStyle w:val="BodyText"/>
+        <w:bidi w:val="0"/>
+        <w:spacing w:before="0" w:after="0"/>
+        <w:jc w:val="start"/>
+        <w:rPr>
+          <w:rFonts w:ascii="Consolas" w:hAnsi="Consolas"/>
+          <w:sz w:val="20"/>
+          <w:szCs w:val="20"/>
+        </w:rPr>
+      </w:pPr>
+      <w:r>
+        <w:rPr>
+          <w:rFonts w:ascii="Consolas" w:hAnsi="Consolas"/>
+          <w:sz w:val="20"/>
+          <w:szCs w:val="20"/>
+        </w:rPr>
+        <w:t>publisher = {{University of Otago}}</w:t>
+      </w:r>
+    </w:p>
+    <w:p>
+      <w:pPr>
+        <w:pStyle w:val="BodyText"/>
+        <w:bidi w:val="0"/>
+        <w:spacing w:before="0" w:after="0"/>
+        <w:jc w:val="start"/>
+        <w:rPr>
+          <w:rFonts w:ascii="Consolas" w:hAnsi="Consolas"/>
+          <w:sz w:val="20"/>
+          <w:szCs w:val="20"/>
+        </w:rPr>
+      </w:pPr>
+      <w:r>
+        <w:rPr>
+          <w:rFonts w:ascii="Consolas" w:hAnsi="Consolas"/>
+          <w:sz w:val="20"/>
+          <w:szCs w:val="20"/>
+        </w:rPr>
+        <w:t>}</w:t>
+      </w:r>
+    </w:p>
+    <w:p>
+      <w:pPr>
+        <w:pStyle w:val="BodyText"/>
+        <w:bidi w:val="0"/>
+        <w:spacing w:before="0" w:after="0"/>
+        <w:jc w:val="start"/>
+        <w:rPr>
+          <w:rFonts w:ascii="Times New Roman" w:hAnsi="Times New Roman"/>
+        </w:rPr>
+      </w:pPr>
+      <w:r>
+        <w:rPr/>
+      </w:r>
+    </w:p>
+    <w:p>
+      <w:pPr>
+        <w:pStyle w:val="BodyText"/>
+        <w:bidi w:val="0"/>
+        <w:spacing w:before="0" w:after="0"/>
+        <w:jc w:val="start"/>
+        <w:rPr>
+          <w:rFonts w:ascii="Times New Roman" w:hAnsi="Times New Roman"/>
+          <w:sz w:val="20"/>
+          <w:szCs w:val="20"/>
+        </w:rPr>
+      </w:pPr>
+      <w:r>
+        <w:rPr>
+          <w:rFonts w:ascii="Times New Roman" w:hAnsi="Times New Roman"/>
+          <w:sz w:val="20"/>
+          <w:szCs w:val="20"/>
+        </w:rPr>
+        <w:t xml:space="preserve">At Otago, Brian Cox </w:t>
+      </w:r>
+      <w:r>
+        <w:rPr>
+          <w:rFonts w:ascii="Times New Roman" w:hAnsi="Times New Roman"/>
+          <w:sz w:val="20"/>
+          <w:szCs w:val="20"/>
+        </w:rPr>
+        <w:t xml:space="preserve">(b 1938, </w:t>
+      </w:r>
+      <w:r>
+        <w:rPr>
+          <w:rFonts w:ascii="Times New Roman" w:hAnsi="Times New Roman"/>
+          <w:sz w:val="20"/>
+          <w:szCs w:val="20"/>
+        </w:rPr>
+        <w:t>who was</w:t>
+      </w:r>
+      <w:r>
+        <w:rPr>
+          <w:rFonts w:ascii="Times New Roman" w:hAnsi="Times New Roman"/>
+          <w:sz w:val="20"/>
+          <w:szCs w:val="20"/>
+        </w:rPr>
+        <w:t xml:space="preserve"> an EDSAC 2 user as a Physics PhD student in Cambridge in 1960/63, trained by Maurice Wilkes [my lecturer for numerical analysis in 1966/67] and David Barron [my supervisor for numerical analysis in 1966/67]) </w:t>
+      </w:r>
+      <w:r>
+        <w:rPr>
+          <w:rFonts w:ascii="Times New Roman" w:hAnsi="Times New Roman"/>
+          <w:sz w:val="20"/>
+          <w:szCs w:val="20"/>
+        </w:rPr>
+        <w:t xml:space="preserve">was appointed as “Lecturer in Charge of the Computer Centre” in 1964, but had to wait 20 years to become the Professor of Computer Science </w:t>
+      </w:r>
+      <w:r>
+        <w:rPr>
+          <w:rFonts w:ascii="Times New Roman" w:hAnsi="Times New Roman"/>
+          <w:sz w:val="20"/>
+          <w:szCs w:val="20"/>
+        </w:rPr>
+        <w:t xml:space="preserve">(1984-2000). </w:t>
+      </w:r>
+      <w:r>
+        <w:rPr>
+          <w:rFonts w:ascii="Times New Roman" w:hAnsi="Times New Roman"/>
+          <w:sz w:val="20"/>
+          <w:szCs w:val="20"/>
+        </w:rPr>
+        <w:t xml:space="preserve">Computing papers were taught from 1966, papers called CS were taught from 1972,  but it was another 12 years before CS </w:t>
+      </w:r>
+      <w:r>
+        <w:rPr>
+          <w:rFonts w:ascii="Times New Roman" w:hAnsi="Times New Roman"/>
+          <w:sz w:val="20"/>
+          <w:szCs w:val="20"/>
+        </w:rPr>
+        <w:t xml:space="preserve">finally became a Department </w:t>
+      </w:r>
+      <w:r>
+        <w:rPr>
+          <w:rFonts w:ascii="Times New Roman" w:hAnsi="Times New Roman"/>
+          <w:sz w:val="20"/>
+          <w:szCs w:val="20"/>
+        </w:rPr>
+        <w:t>in 1984</w:t>
+      </w:r>
+      <w:r>
+        <w:rPr>
+          <w:rFonts w:ascii="Times New Roman" w:hAnsi="Times New Roman"/>
+          <w:sz w:val="20"/>
+          <w:szCs w:val="20"/>
+        </w:rPr>
+        <w:t>.</w:t>
+      </w:r>
+    </w:p>
+    <w:p>
+      <w:pPr>
+        <w:pStyle w:val="BodyText"/>
+        <w:bidi w:val="0"/>
+        <w:spacing w:before="0" w:after="0"/>
+        <w:jc w:val="start"/>
+        <w:rPr>
+          <w:rFonts w:ascii="Times New Roman" w:hAnsi="Times New Roman"/>
+          <w:sz w:val="20"/>
+          <w:szCs w:val="20"/>
+        </w:rPr>
+      </w:pPr>
+      <w:r>
+        <w:rPr>
+          <w:rFonts w:ascii="Times New Roman" w:hAnsi="Times New Roman"/>
+          <w:sz w:val="20"/>
+          <w:szCs w:val="20"/>
+        </w:rPr>
+      </w:r>
+    </w:p>
+    <w:p>
+      <w:pPr>
+        <w:pStyle w:val="BodyText"/>
+        <w:bidi w:val="0"/>
+        <w:spacing w:before="0" w:after="0"/>
+        <w:jc w:val="start"/>
+        <w:rPr>
+          <w:rFonts w:ascii="Times New Roman" w:hAnsi="Times New Roman"/>
+          <w:sz w:val="20"/>
+          <w:szCs w:val="20"/>
+        </w:rPr>
+      </w:pPr>
+      <w:r>
+        <w:rPr>
+          <w:rFonts w:ascii="Times New Roman" w:hAnsi="Times New Roman"/>
+          <w:sz w:val="20"/>
+          <w:szCs w:val="20"/>
+        </w:rPr>
+        <w:t>The first computer was an IBM 360/30 in 1966, kept until the B6700 was well established  in 1972.</w:t>
+      </w:r>
+    </w:p>
+    <w:p>
+      <w:pPr>
+        <w:pStyle w:val="BodyText"/>
+        <w:bidi w:val="0"/>
+        <w:spacing w:before="0" w:after="0"/>
+        <w:jc w:val="start"/>
+        <w:rPr>
+          <w:rFonts w:ascii="Times New Roman" w:hAnsi="Times New Roman"/>
+          <w:sz w:val="20"/>
+          <w:szCs w:val="20"/>
+        </w:rPr>
+      </w:pPr>
+      <w:r>
+        <w:rPr>
+          <w:rFonts w:ascii="Times New Roman" w:hAnsi="Times New Roman"/>
+          <w:sz w:val="20"/>
+          <w:szCs w:val="20"/>
+        </w:rPr>
+      </w:r>
+    </w:p>
+    <w:p>
+      <w:pPr>
+        <w:pStyle w:val="BodyText"/>
+        <w:bidi w:val="0"/>
+        <w:spacing w:before="0" w:after="0"/>
+        <w:jc w:val="start"/>
+        <w:rPr>
+          <w:rFonts w:ascii="Times New Roman" w:hAnsi="Times New Roman"/>
+          <w:sz w:val="20"/>
+          <w:szCs w:val="20"/>
+        </w:rPr>
+      </w:pPr>
+      <w:r>
+        <w:rPr>
+          <w:rFonts w:ascii="Times New Roman" w:hAnsi="Times New Roman"/>
+          <w:sz w:val="20"/>
+          <w:szCs w:val="20"/>
+        </w:rPr>
+        <w:t>The first NZCS national conference in 1968 led to a committee on training requirements, which recommended CS undergraduate courses at every university, as well as some postgrad and extramural courses. The committee “saw it as the primary role of Computer Science departments to educate system programmers, as well as future researchers” and recommended that “Commerce Departments should deal with teaching system analysts and managers.”</w:t>
+      </w:r>
+    </w:p>
+    <w:p>
+      <w:pPr>
+        <w:pStyle w:val="BodyText"/>
+        <w:bidi w:val="0"/>
+        <w:spacing w:before="0" w:after="0"/>
+        <w:jc w:val="start"/>
+        <w:rPr>
+          <w:rFonts w:ascii="Times New Roman" w:hAnsi="Times New Roman"/>
+          <w:sz w:val="20"/>
+          <w:szCs w:val="20"/>
+        </w:rPr>
+      </w:pPr>
+      <w:r>
+        <w:rPr>
+          <w:rFonts w:ascii="Times New Roman" w:hAnsi="Times New Roman"/>
+          <w:sz w:val="20"/>
+          <w:szCs w:val="20"/>
+        </w:rPr>
+      </w:r>
+    </w:p>
+    <w:p>
+      <w:pPr>
+        <w:pStyle w:val="PreformattedText"/>
+        <w:bidi w:val="0"/>
+        <w:spacing w:before="0" w:after="0"/>
+        <w:jc w:val="start"/>
+        <w:rPr>
+          <w:rFonts w:ascii="Times New Roman" w:hAnsi="Times New Roman"/>
+        </w:rPr>
+      </w:pPr>
+      <w:r>
+        <w:rPr/>
       </w:r>
     </w:p>
     <w:sectPr>
@@ -14221,7 +14847,7 @@
       <w:jc w:val="center"/>
       <w:rPr/>
     </w:pPr>
-    <w:bookmarkStart w:id="24" w:name="PageNumWizard_FOOTER_Default_Page_Style1"/>
+    <w:bookmarkStart w:id="26" w:name="PageNumWizard_FOOTER_Default_Page_Style1"/>
     <w:r>
       <w:rPr/>
       <w:fldChar w:fldCharType="begin"/>
@@ -14236,13 +14862,13 @@
     </w:r>
     <w:r>
       <w:rPr/>
-      <w:t>20</w:t>
+      <w:t>21</w:t>
     </w:r>
     <w:r>
       <w:rPr/>
       <w:fldChar w:fldCharType="end"/>
     </w:r>
-    <w:bookmarkEnd w:id="24"/>
+    <w:bookmarkEnd w:id="26"/>
   </w:p>
 </w:ftr>
 </file>

</xml_diff>